<commit_message>
Currere Final Draft is due Tue Nov 3, 11:59 p.m.
Todd moved the due date from Mon Nov 2. Course home, both Week 10 outlines,
the Final Draft handout and the Currere Guidelines handout now say Nov 3.

Co-Authored-By: Claude Opus 5.5 <noreply@anthropic.com>
</commit_message>
<xml_diff>
--- a/week-10-mentors-and-the-hinge/Currere Final Draft.docx
+++ b/week-10-mentors-and-the-hinge/Currere Final Draft.docx
@@ -73,7 +73,7 @@
           <w:sz w:val="22"/>
           <w:szCs w:val="22"/>
         </w:rPr>
-        <w:t>Currere is Latin for “to run,” the way a current runs — an autobiographical method William Pinar built to help you understand your own life in schools and what it is making you into as a teacher. You have already done it five times in miniature; every One-Pager was a tiny currere. This is the full version, sustained on one thread that matters to you. The Final Draft is the finished piece, due Monday, November 2, at 11:59 p.m.</w:t>
+        <w:t>Currere is Latin for “to run,” the way a current runs — an autobiographical method William Pinar built to help you understand your own life in schools and what it is making you into as a teacher. You have already done it five times in miniature; every One-Pager was a tiny currere. This is the full version, sustained on one thread that matters to you. The Final Draft is the finished piece, due Tuesday, November 3, at 11:59 p.m.</w:t>
       </w:r>
     </w:p>
     <w:p>
@@ -278,7 +278,7 @@
           <w:sz w:val="22"/>
           <w:szCs w:val="22"/>
         </w:rPr>
-        <w:t>Submit as a single PDF, with your audio as a complete URL and your AI-use log. Due Monday, November 2, at 11:59 p.m.</w:t>
+        <w:t>Submit as a single PDF, with your audio as a complete URL and your AI-use log. Due Tuesday, November 3, at 11:59 p.m.</w:t>
       </w:r>
     </w:p>
     <w:p>

</xml_diff>